<commit_message>
creating complete data files 2010
</commit_message>
<xml_diff>
--- a/notebooks/2010_Birth/First Stage 2010/01_birth_records_quality_report.docx
+++ b/notebooks/2010_Birth/First Stage 2010/01_birth_records_quality_report.docx
@@ -13,12 +13,12 @@
     </w:p>
     <w:p>
       <w:r>
-        <w:t>Generated: 2026-03-31 19:29</w:t>
+        <w:t>Generated: 2026-04-30 20:18</w:t>
       </w:r>
     </w:p>
     <w:p>
       <w:r>
-        <w:t>Dataset: 363,881 birth records × 18 variables</w:t>
+        <w:t>Dataset: 363,863 birth records × 18 variables</w:t>
       </w:r>
     </w:p>
     <w:p/>
@@ -37,19 +37,19 @@
         <w:t>Key findings include:</w:t>
         <w:br/>
         <w:br/>
-        <w:t>• **Dataset Overview**: 363,881 total birth records with 18 variables</w:t>
+        <w:t>• **Dataset Overview**: 363,863 total birth records with 18 variables</w:t>
         <w:br/>
-        <w:t>• **Data Completeness**: 318,290 records (87.5%) are completely filled with no missing values</w:t>
+        <w:t>• **Data Completeness**: 318,288 records (87.5%) are completely filled with no missing values</w:t>
         <w:br/>
-        <w:t>• **Records with Missing Data**: 45,591 records (12.5%) contain at least one missing value</w:t>
+        <w:t>• **Records with Missing Data**: 45,575 records (12.5%) contain at least one missing value</w:t>
         <w:br/>
-        <w:t>• **Total Missing Values**: 45,850 missing values across all variables (0.7% of all data)</w:t>
+        <w:t>• **Total Missing Values**: 45,851 missing values across all variables (0.7% of all data)</w:t>
         <w:br/>
         <w:t>• **Average Completeness**: Each record has an average of 0.13 missing values</w:t>
         <w:br/>
-        <w:t>• **Maximum Missing**: The record with most missing data has 2 missing values</w:t>
+        <w:t>• **Maximum Missing**: The record with most missing data has 18 missing values</w:t>
         <w:br/>
-        <w:t>• **Variables with Missing Data**: 3 out of 18 variables have missing values</w:t>
+        <w:t>• **Variables with Missing Data**: 18 out of 18 variables have missing values</w:t>
         <w:br/>
         <w:t>• **Critical Variables**: ['Birth_Weight(grams)', 'Race_of_Father', 'Birth_Order'] have the highest missing rates</w:t>
       </w:r>
@@ -127,7 +127,7 @@
               <w:jc w:val="right"/>
             </w:pPr>
             <w:r>
-              <w:t>363881.0</w:t>
+              <w:t>363863.0</w:t>
             </w:r>
           </w:p>
         </w:tc>
@@ -177,7 +177,7 @@
               <w:jc w:val="right"/>
             </w:pPr>
             <w:r>
-              <w:t>3.0</w:t>
+              <w:t>18.0</w:t>
             </w:r>
           </w:p>
         </w:tc>
@@ -202,7 +202,7 @@
               <w:jc w:val="right"/>
             </w:pPr>
             <w:r>
-              <w:t>45850.0</w:t>
+              <w:t>45851.0</w:t>
             </w:r>
           </w:p>
         </w:tc>
@@ -252,7 +252,7 @@
               <w:jc w:val="right"/>
             </w:pPr>
             <w:r>
-              <w:t>318290.0</w:t>
+              <w:t>318288.0</w:t>
             </w:r>
           </w:p>
         </w:tc>
@@ -277,7 +277,7 @@
               <w:jc w:val="right"/>
             </w:pPr>
             <w:r>
-              <w:t>45591.0</w:t>
+              <w:t>45575.0</w:t>
             </w:r>
           </w:p>
         </w:tc>
@@ -377,7 +377,7 @@
               <w:jc w:val="right"/>
             </w:pPr>
             <w:r>
-              <w:t>2.0</w:t>
+              <w:t>18.0</w:t>
             </w:r>
           </w:p>
         </w:tc>
@@ -393,7 +393,7 @@
     </w:p>
     <w:p>
       <w:r>
-        <w:t>Found 318,290 completely filled birth records (87.5% of total). These records can be used for immediate analysis without imputation.</w:t>
+        <w:t>Found 318,288 completely filled birth records (87.5% of total). These records can be used for immediate analysis without imputation.</w:t>
       </w:r>
     </w:p>
     <w:p>
@@ -411,7 +411,7 @@
     </w:p>
     <w:p>
       <w:r>
-        <w:t>Found 45,591 records with at least one missing value (12.5% of total). These records require data imputation or careful handling in analysis.</w:t>
+        <w:t>Found 45,575 records with at least one missing value (12.5% of total). These records require data imputation or careful handling in analysis.</w:t>
       </w:r>
     </w:p>
     <w:p>
@@ -480,7 +480,7 @@
       <w:r>
         <w:drawing>
           <wp:inline xmlns:a="http://schemas.openxmlformats.org/drawingml/2006/main" xmlns:pic="http://schemas.openxmlformats.org/drawingml/2006/picture">
-            <wp:extent cx="5943600" cy="3543300"/>
+            <wp:extent cx="5943600" cy="3539717"/>
             <wp:docPr id="2" name="Picture 2"/>
             <wp:cNvGraphicFramePr>
               <a:graphicFrameLocks noChangeAspect="1"/>
@@ -501,7 +501,7 @@
                   <pic:spPr>
                     <a:xfrm>
                       <a:off x="0" y="0"/>
-                      <a:ext cx="5943600" cy="3543300"/>
+                      <a:ext cx="5943600" cy="3539717"/>
                     </a:xfrm>
                     <a:prstGeom prst="rect"/>
                   </pic:spPr>
@@ -680,7 +680,7 @@
               <w:jc w:val="right"/>
             </w:pPr>
             <w:r>
-              <w:t>45,303</w:t>
+              <w:t>45,287</w:t>
             </w:r>
           </w:p>
         </w:tc>
@@ -729,7 +729,7 @@
               <w:jc w:val="right"/>
             </w:pPr>
             <w:r>
-              <w:t>318,578</w:t>
+              <w:t>318,576</w:t>
             </w:r>
           </w:p>
         </w:tc>
@@ -767,7 +767,7 @@
               <w:jc w:val="right"/>
             </w:pPr>
             <w:r>
-              <w:t>531</w:t>
+              <w:t>532</w:t>
             </w:r>
           </w:p>
         </w:tc>
@@ -816,7 +816,7 @@
               <w:jc w:val="right"/>
             </w:pPr>
             <w:r>
-              <w:t>363,350</w:t>
+              <w:t>363,331</w:t>
             </w:r>
           </w:p>
         </w:tc>
@@ -854,7 +854,7 @@
               <w:jc w:val="right"/>
             </w:pPr>
             <w:r>
-              <w:t>16</w:t>
+              <w:t>17</w:t>
             </w:r>
           </w:p>
         </w:tc>
@@ -903,7 +903,7 @@
               <w:jc w:val="right"/>
             </w:pPr>
             <w:r>
-              <w:t>363,865</w:t>
+              <w:t>363,846</w:t>
             </w:r>
           </w:p>
         </w:tc>
@@ -941,7 +941,7 @@
               <w:jc w:val="right"/>
             </w:pPr>
             <w:r>
-              <w:t>0</w:t>
+              <w:t>1</w:t>
             </w:r>
           </w:p>
         </w:tc>
@@ -964,7 +964,7 @@
           </w:tcPr>
           <w:p>
             <w:r>
-              <w:t>int64</w:t>
+              <w:t>float64</w:t>
             </w:r>
           </w:p>
         </w:tc>
@@ -990,7 +990,7 @@
               <w:jc w:val="right"/>
             </w:pPr>
             <w:r>
-              <w:t>363,881</w:t>
+              <w:t>363,862</w:t>
             </w:r>
           </w:p>
         </w:tc>
@@ -1028,7 +1028,7 @@
               <w:jc w:val="right"/>
             </w:pPr>
             <w:r>
-              <w:t>0</w:t>
+              <w:t>1</w:t>
             </w:r>
           </w:p>
         </w:tc>
@@ -1051,7 +1051,7 @@
           </w:tcPr>
           <w:p>
             <w:r>
-              <w:t>int64</w:t>
+              <w:t>float64</w:t>
             </w:r>
           </w:p>
         </w:tc>
@@ -1077,7 +1077,7 @@
               <w:jc w:val="right"/>
             </w:pPr>
             <w:r>
-              <w:t>363,881</w:t>
+              <w:t>363,862</w:t>
             </w:r>
           </w:p>
         </w:tc>
@@ -1115,7 +1115,7 @@
               <w:jc w:val="right"/>
             </w:pPr>
             <w:r>
-              <w:t>0</w:t>
+              <w:t>1</w:t>
             </w:r>
           </w:p>
         </w:tc>
@@ -1164,7 +1164,7 @@
               <w:jc w:val="right"/>
             </w:pPr>
             <w:r>
-              <w:t>363,881</w:t>
+              <w:t>363,862</w:t>
             </w:r>
           </w:p>
         </w:tc>
@@ -1202,7 +1202,7 @@
               <w:jc w:val="right"/>
             </w:pPr>
             <w:r>
-              <w:t>0</w:t>
+              <w:t>1</w:t>
             </w:r>
           </w:p>
         </w:tc>
@@ -1225,7 +1225,7 @@
           </w:tcPr>
           <w:p>
             <w:r>
-              <w:t>int64</w:t>
+              <w:t>float64</w:t>
             </w:r>
           </w:p>
         </w:tc>
@@ -1251,7 +1251,7 @@
               <w:jc w:val="right"/>
             </w:pPr>
             <w:r>
-              <w:t>363,881</w:t>
+              <w:t>363,862</w:t>
             </w:r>
           </w:p>
         </w:tc>
@@ -1289,7 +1289,7 @@
               <w:jc w:val="right"/>
             </w:pPr>
             <w:r>
-              <w:t>0</w:t>
+              <w:t>1</w:t>
             </w:r>
           </w:p>
         </w:tc>
@@ -1312,7 +1312,7 @@
           </w:tcPr>
           <w:p>
             <w:r>
-              <w:t>int64</w:t>
+              <w:t>float64</w:t>
             </w:r>
           </w:p>
         </w:tc>
@@ -1338,7 +1338,7 @@
               <w:jc w:val="right"/>
             </w:pPr>
             <w:r>
-              <w:t>363,881</w:t>
+              <w:t>363,862</w:t>
             </w:r>
           </w:p>
         </w:tc>
@@ -1376,7 +1376,7 @@
               <w:jc w:val="right"/>
             </w:pPr>
             <w:r>
-              <w:t>0</w:t>
+              <w:t>1</w:t>
             </w:r>
           </w:p>
         </w:tc>
@@ -1425,7 +1425,7 @@
               <w:jc w:val="right"/>
             </w:pPr>
             <w:r>
-              <w:t>363,881</w:t>
+              <w:t>363,862</w:t>
             </w:r>
           </w:p>
         </w:tc>
@@ -1463,7 +1463,7 @@
               <w:jc w:val="right"/>
             </w:pPr>
             <w:r>
-              <w:t>0</w:t>
+              <w:t>1</w:t>
             </w:r>
           </w:p>
         </w:tc>
@@ -1486,7 +1486,7 @@
           </w:tcPr>
           <w:p>
             <w:r>
-              <w:t>int64</w:t>
+              <w:t>float64</w:t>
             </w:r>
           </w:p>
         </w:tc>
@@ -1512,7 +1512,7 @@
               <w:jc w:val="right"/>
             </w:pPr>
             <w:r>
-              <w:t>363,881</w:t>
+              <w:t>363,862</w:t>
             </w:r>
           </w:p>
         </w:tc>
@@ -1550,7 +1550,7 @@
               <w:jc w:val="right"/>
             </w:pPr>
             <w:r>
-              <w:t>0</w:t>
+              <w:t>1</w:t>
             </w:r>
           </w:p>
         </w:tc>
@@ -1599,7 +1599,7 @@
               <w:jc w:val="right"/>
             </w:pPr>
             <w:r>
-              <w:t>363,881</w:t>
+              <w:t>363,862</w:t>
             </w:r>
           </w:p>
         </w:tc>
@@ -1637,7 +1637,7 @@
               <w:jc w:val="right"/>
             </w:pPr>
             <w:r>
-              <w:t>0</w:t>
+              <w:t>1</w:t>
             </w:r>
           </w:p>
         </w:tc>
@@ -1686,7 +1686,7 @@
               <w:jc w:val="right"/>
             </w:pPr>
             <w:r>
-              <w:t>363,881</w:t>
+              <w:t>363,862</w:t>
             </w:r>
           </w:p>
         </w:tc>
@@ -1724,7 +1724,7 @@
               <w:jc w:val="right"/>
             </w:pPr>
             <w:r>
-              <w:t>0</w:t>
+              <w:t>1</w:t>
             </w:r>
           </w:p>
         </w:tc>
@@ -1773,7 +1773,7 @@
               <w:jc w:val="right"/>
             </w:pPr>
             <w:r>
-              <w:t>363,881</w:t>
+              <w:t>363,862</w:t>
             </w:r>
           </w:p>
         </w:tc>
@@ -1811,7 +1811,7 @@
               <w:jc w:val="right"/>
             </w:pPr>
             <w:r>
-              <w:t>0</w:t>
+              <w:t>1</w:t>
             </w:r>
           </w:p>
         </w:tc>
@@ -1860,7 +1860,7 @@
               <w:jc w:val="right"/>
             </w:pPr>
             <w:r>
-              <w:t>363,881</w:t>
+              <w:t>363,862</w:t>
             </w:r>
           </w:p>
         </w:tc>
@@ -1898,7 +1898,7 @@
               <w:jc w:val="right"/>
             </w:pPr>
             <w:r>
-              <w:t>0</w:t>
+              <w:t>1</w:t>
             </w:r>
           </w:p>
         </w:tc>
@@ -1921,7 +1921,7 @@
           </w:tcPr>
           <w:p>
             <w:r>
-              <w:t>int64</w:t>
+              <w:t>float64</w:t>
             </w:r>
           </w:p>
         </w:tc>
@@ -1947,7 +1947,7 @@
               <w:jc w:val="right"/>
             </w:pPr>
             <w:r>
-              <w:t>363,881</w:t>
+              <w:t>363,862</w:t>
             </w:r>
           </w:p>
         </w:tc>
@@ -1985,7 +1985,7 @@
               <w:jc w:val="right"/>
             </w:pPr>
             <w:r>
-              <w:t>0</w:t>
+              <w:t>1</w:t>
             </w:r>
           </w:p>
         </w:tc>
@@ -2034,7 +2034,7 @@
               <w:jc w:val="right"/>
             </w:pPr>
             <w:r>
-              <w:t>363,881</w:t>
+              <w:t>363,862</w:t>
             </w:r>
           </w:p>
         </w:tc>
@@ -2072,7 +2072,7 @@
               <w:jc w:val="right"/>
             </w:pPr>
             <w:r>
-              <w:t>0</w:t>
+              <w:t>1</w:t>
             </w:r>
           </w:p>
         </w:tc>
@@ -2108,7 +2108,7 @@
               <w:jc w:val="right"/>
             </w:pPr>
             <w:r>
-              <w:t>26</w:t>
+              <w:t>25</w:t>
             </w:r>
           </w:p>
         </w:tc>
@@ -2121,7 +2121,7 @@
               <w:jc w:val="right"/>
             </w:pPr>
             <w:r>
-              <w:t>363,881</w:t>
+              <w:t>363,862</w:t>
             </w:r>
           </w:p>
         </w:tc>
@@ -2159,7 +2159,7 @@
               <w:jc w:val="right"/>
             </w:pPr>
             <w:r>
-              <w:t>0</w:t>
+              <w:t>1</w:t>
             </w:r>
           </w:p>
         </w:tc>
@@ -2208,7 +2208,7 @@
               <w:jc w:val="right"/>
             </w:pPr>
             <w:r>
-              <w:t>363,881</w:t>
+              <w:t>363,862</w:t>
             </w:r>
           </w:p>
         </w:tc>
@@ -2248,7 +2248,7 @@
         <w:pStyle w:val="ListBullet"/>
       </w:pPr>
       <w:r>
-        <w:t>Use the 318,290 complete records for immediate analysis where possible</w:t>
+        <w:t>Use the 318,288 complete records for immediate analysis where possible</w:t>
       </w:r>
     </w:p>
     <w:p>
@@ -2387,7 +2387,7 @@
       <w:jc w:val="center"/>
     </w:pPr>
     <w:r>
-      <w:t xml:space="preserve">Birth Records Data Quality Assessment | Generated: 2026-03-31 | Page </w:t>
+      <w:t xml:space="preserve">Birth Records Data Quality Assessment | Generated: 2026-04-30 | Page </w:t>
     </w:r>
     <w:r>
       <w:fldChar w:fldCharType="begin"/>

</xml_diff>